<commit_message>
edits to final page
</commit_message>
<xml_diff>
--- a/My Musical Journey.docx
+++ b/My Musical Journey.docx
@@ -318,17 +318,6 @@
     </w:p>
     <w:p>
       <w:pPr>
-        <w:jc w:val="center"/>
-      </w:pPr>
-      <w:r>
-        <w:t>Armored</w:t>
-      </w:r>
-      <w:r>
-        <w:t xml:space="preserve"> Saint</w:t>
-      </w:r>
-    </w:p>
-    <w:p>
-      <w:pPr>
         <w:pStyle w:val="Heading4"/>
         <w:jc w:val="center"/>
       </w:pPr>
@@ -358,13 +347,8 @@
         <w:jc w:val="center"/>
       </w:pPr>
       <w:r>
-        <w:t xml:space="preserve">The </w:t>
-      </w:r>
-      <w:proofErr w:type="spellStart"/>
-      <w:r>
-        <w:t>Weeknd</w:t>
-      </w:r>
-      <w:proofErr w:type="spellEnd"/>
+        <w:t>The Weeknd</w:t>
+      </w:r>
     </w:p>
     <w:p>
       <w:pPr>
@@ -440,15 +424,15 @@
         <w:rPr>
           <w:lang w:val="de-DE"/>
         </w:rPr>
+        <w:t>Lil Uzi Vert</w:t>
+      </w:r>
+    </w:p>
+    <w:p>
+      <w:pPr>
+        <w:jc w:val="center"/>
+      </w:pPr>
+      <w:r>
         <w:lastRenderedPageBreak/>
-        <w:t>Lil Uzi Vert</w:t>
-      </w:r>
-    </w:p>
-    <w:p>
-      <w:pPr>
-        <w:jc w:val="center"/>
-      </w:pPr>
-      <w:r>
         <w:t>Odd Future</w:t>
       </w:r>
     </w:p>
@@ -497,13 +481,8 @@
         <w:jc w:val="center"/>
       </w:pPr>
       <w:r>
-        <w:t>Ty Dolla $</w:t>
-      </w:r>
-      <w:proofErr w:type="spellStart"/>
-      <w:r>
-        <w:t>ign</w:t>
-      </w:r>
-      <w:proofErr w:type="spellEnd"/>
+        <w:t>Ty Dolla $ign</w:t>
+      </w:r>
     </w:p>
     <w:p>
       <w:pPr>
@@ -658,6 +637,14 @@
       </w:pPr>
       <w:r>
         <w:t>Pink Floyd</w:t>
+      </w:r>
+    </w:p>
+    <w:p>
+      <w:pPr>
+        <w:jc w:val="center"/>
+      </w:pPr>
+      <w:r>
+        <w:t>Journey</w:t>
       </w:r>
     </w:p>
     <w:p>
@@ -725,6 +712,14 @@
       </w:pPr>
       <w:r>
         <w:t>Bruce Dickinson</w:t>
+      </w:r>
+    </w:p>
+    <w:p>
+      <w:pPr>
+        <w:jc w:val="center"/>
+      </w:pPr>
+      <w:r>
+        <w:t>Armored Saint</w:t>
       </w:r>
     </w:p>
     <w:p>
@@ -2128,6 +2123,21 @@
 </file>
 
 <file path=customXml/item1.xml><?xml version="1.0" encoding="utf-8"?>
+<p:properties xmlns:p="http://schemas.microsoft.com/office/2006/metadata/properties" xmlns:xsi="http://www.w3.org/2001/XMLSchema-instance" xmlns:pc="http://schemas.microsoft.com/office/infopath/2007/PartnerControls">
+  <documentManagement/>
+</p:properties>
+</file>
+
+<file path=customXml/item2.xml><?xml version="1.0" encoding="utf-8"?>
+<?mso-contentType ?>
+<FormTemplates xmlns="http://schemas.microsoft.com/sharepoint/v3/contenttype/forms">
+  <Display>DocumentLibraryForm</Display>
+  <Edit>DocumentLibraryForm</Edit>
+  <New>DocumentLibraryForm</New>
+</FormTemplates>
+</file>
+
+<file path=customXml/item3.xml><?xml version="1.0" encoding="utf-8"?>
 <ct:contentTypeSchema xmlns:ct="http://schemas.microsoft.com/office/2006/metadata/contentType" xmlns:ma="http://schemas.microsoft.com/office/2006/metadata/properties/metaAttributes" ct:_="" ma:_="" ma:contentTypeName="Document" ma:contentTypeID="0x0101004CFE203B4AD56C4FB0AC50DB82146048" ma:contentTypeVersion="1" ma:contentTypeDescription="Create a new document." ma:contentTypeScope="" ma:versionID="f411bd742ebb208c72060d151961c403">
   <xsd:schema xmlns:xsd="http://www.w3.org/2001/XMLSchema" xmlns:xs="http://www.w3.org/2001/XMLSchema" xmlns:p="http://schemas.microsoft.com/office/2006/metadata/properties" xmlns:ns3="b98134fb-8c65-4836-85e1-842ead28dbf8" targetNamespace="http://schemas.microsoft.com/office/2006/metadata/properties" ma:root="true" ma:fieldsID="b063c4ead0dc3c758d8abf304b8cfeef" ns3:_="">
     <xsd:import namespace="b98134fb-8c65-4836-85e1-842ead28dbf8"/>
@@ -2253,26 +2263,28 @@
 </ct:contentTypeSchema>
 </file>
 
-<file path=customXml/item2.xml><?xml version="1.0" encoding="utf-8"?>
-<?mso-contentType ?>
-<FormTemplates xmlns="http://schemas.microsoft.com/sharepoint/v3/contenttype/forms">
-  <Display>DocumentLibraryForm</Display>
-  <Edit>DocumentLibraryForm</Edit>
-  <New>DocumentLibraryForm</New>
-</FormTemplates>
-</file>
-
-<file path=customXml/item3.xml><?xml version="1.0" encoding="utf-8"?>
-<p:properties xmlns:p="http://schemas.microsoft.com/office/2006/metadata/properties" xmlns:xsi="http://www.w3.org/2001/XMLSchema-instance" xmlns:pc="http://schemas.microsoft.com/office/infopath/2007/PartnerControls">
-  <documentManagement/>
-</p:properties>
-</file>
-
 <file path=customXml/item4.xml><?xml version="1.0" encoding="utf-8"?>
 <b:Sources xmlns:b="http://schemas.openxmlformats.org/officeDocument/2006/bibliography" xmlns="http://schemas.openxmlformats.org/officeDocument/2006/bibliography" SelectedStyle="\APASixthEditionOfficeOnline.xsl" StyleName="APA" Version="6"/>
 </file>
 
 <file path=customXml/itemProps1.xml><?xml version="1.0" encoding="utf-8"?>
+<ds:datastoreItem xmlns:ds="http://schemas.openxmlformats.org/officeDocument/2006/customXml" ds:itemID="{60529BE6-A8EE-4E94-8138-B6DF2A6DECF4}">
+  <ds:schemaRefs>
+    <ds:schemaRef ds:uri="http://schemas.microsoft.com/office/2006/metadata/properties"/>
+    <ds:schemaRef ds:uri="http://schemas.microsoft.com/office/infopath/2007/PartnerControls"/>
+  </ds:schemaRefs>
+</ds:datastoreItem>
+</file>
+
+<file path=customXml/itemProps2.xml><?xml version="1.0" encoding="utf-8"?>
+<ds:datastoreItem xmlns:ds="http://schemas.openxmlformats.org/officeDocument/2006/customXml" ds:itemID="{D8CBC3CA-9CBC-45FE-BECB-BD82BCED6898}">
+  <ds:schemaRefs>
+    <ds:schemaRef ds:uri="http://schemas.microsoft.com/sharepoint/v3/contenttype/forms"/>
+  </ds:schemaRefs>
+</ds:datastoreItem>
+</file>
+
+<file path=customXml/itemProps3.xml><?xml version="1.0" encoding="utf-8"?>
 <ds:datastoreItem xmlns:ds="http://schemas.openxmlformats.org/officeDocument/2006/customXml" ds:itemID="{1E722F58-A05A-4DF8-AC0C-220F6F781CF5}">
   <ds:schemaRefs>
     <ds:schemaRef ds:uri="http://schemas.microsoft.com/office/2006/metadata/contentType"/>
@@ -2290,23 +2302,6 @@
 </ds:datastoreItem>
 </file>
 
-<file path=customXml/itemProps2.xml><?xml version="1.0" encoding="utf-8"?>
-<ds:datastoreItem xmlns:ds="http://schemas.openxmlformats.org/officeDocument/2006/customXml" ds:itemID="{D8CBC3CA-9CBC-45FE-BECB-BD82BCED6898}">
-  <ds:schemaRefs>
-    <ds:schemaRef ds:uri="http://schemas.microsoft.com/sharepoint/v3/contenttype/forms"/>
-  </ds:schemaRefs>
-</ds:datastoreItem>
-</file>
-
-<file path=customXml/itemProps3.xml><?xml version="1.0" encoding="utf-8"?>
-<ds:datastoreItem xmlns:ds="http://schemas.openxmlformats.org/officeDocument/2006/customXml" ds:itemID="{60529BE6-A8EE-4E94-8138-B6DF2A6DECF4}">
-  <ds:schemaRefs>
-    <ds:schemaRef ds:uri="http://schemas.microsoft.com/office/2006/metadata/properties"/>
-    <ds:schemaRef ds:uri="http://schemas.microsoft.com/office/infopath/2007/PartnerControls"/>
-  </ds:schemaRefs>
-</ds:datastoreItem>
-</file>
-
 <file path=customXml/itemProps4.xml><?xml version="1.0" encoding="utf-8"?>
 <ds:datastoreItem xmlns:ds="http://schemas.openxmlformats.org/officeDocument/2006/customXml" ds:itemID="{A426361A-96A6-4696-A289-4C3BCA96AEBE}">
   <ds:schemaRefs>

</xml_diff>